<commit_message>
Batch 2: Ma 15 + Joey 15 - cross-references added
</commit_message>
<xml_diff>
--- a/stories/docx/Joey 15.docx
+++ b/stories/docx/Joey 15.docx
@@ -31,15 +31,31 @@
         <w:pStyle w:val="BodyText"/>
       </w:pPr>
       <w:r>
-        <w:t xml:space="preserve">Things have been strange since Frank left. Not bad at first, just different. The store kept running, and I kept my head down, and I waited. That is what Frank told me to do. Wait. Watch. Let him make the first move.</w:t>
-      </w:r>
-    </w:p>
-    <w:p>
-      <w:pPr>
-        <w:pStyle w:val="BodyText"/>
-      </w:pPr>
-      <w:r>
-        <w:t xml:space="preserve">But the Greek is getting impatient. I can feel it. He has been around the block a long time. He owns buildings on Flatbush Avenue, places he took the same way he is trying to take ours. I hear things. I listen.</w:t>
+        <w:t xml:space="preserve">Things have been strange since Frank left. The store kept running, and I waited. That is what Frank told me to do. Wait. Watch. Let him make the first move.</w:t>
+      </w:r>
+    </w:p>
+    <w:p>
+      <w:pPr>
+        <w:pStyle w:val="BodyText"/>
+      </w:pPr>
+      <w:r>
+        <w:t xml:space="preserve">But the Greek is getting impatient. He has buildings on Flatbush Avenue, places he took the same way he is trying to take ours. I hear things. I listen.</w:t>
+      </w:r>
+    </w:p>
+    <w:p>
+      <w:pPr>
+        <w:pStyle w:val="BodyText"/>
+      </w:pPr>
+      <w:r>
+        <w:t xml:space="preserve">I got a letter from Frank last month. War news — not much, just that he is alive. He mentioned a girl. Lucia. I could tell she matters. I hope she is keeping him safe.</w:t>
+      </w:r>
+    </w:p>
+    <w:p>
+      <w:pPr>
+        <w:pStyle w:val="BodyText"/>
+      </w:pPr>
+      <w:r>
+        <w:t xml:space="preserve">But I cannot think about that now. I have my own war to fight. Here. At home.</w:t>
       </w:r>
     </w:p>
     <w:p>
@@ -73,7 +89,7 @@
         <w:pStyle w:val="BodyText"/>
       </w:pPr>
       <w:r>
-        <w:t xml:space="preserve">But I remembered what Frank said. The panel behind the shelves. The loose floorboard. The back window. He knew, even then, that something like this might happen.</w:t>
+        <w:t xml:space="preserve">But I remembered what Frank said. The panel behind the shelves. The loose floorboard. The back window. He knew, even then, that something like this might happen. He prepared me. And I am glad he did.</w:t>
       </w:r>
     </w:p>
     <w:p>

</xml_diff>